<commit_message>
- rebuild demo with fixed apa7 references
</commit_message>
<xml_diff>
--- a/demo/modules/module_01_citrus_fruits/mod_01_03_lemons.docx
+++ b/demo/modules/module_01_citrus_fruits/mod_01_03_lemons.docx
@@ -185,7 +185,7 @@
       </w:pPr>
       <w:r>
         <w:rPr/>
-        <w:t>Like oranges and other citrus fruits, lemons belong to the genus Citrus.@ramirez2021citrus These fruits share common botanical features, including segmented flesh and oil-rich skins. However, lemons differ from many citrus varieties in their flavour profile. They contain relatively little natural sugar and a high level of acidity, which gives them their characteristically sour taste.</w:t>
+        <w:t>Like oranges and other citrus fruits, lemons belong to the genus Citrus.[@ramirez2021citrus] These fruits share common botanical features, including segmented flesh and oil-rich skins. However, lemons differ from many citrus varieties in their flavour profile. They contain relatively little natural sugar and a high level of acidity, which gives them their characteristically sour taste.</w:t>
       </w:r>
     </w:p>
     <w:p>
@@ -197,7 +197,7 @@
       </w:pPr>
       <w:r>
         <w:rPr/>
-        <w:t>Because of this intense acidity, lemons are rarely eaten on their own. Instead, they are widely used to enhance other foods and drinks. Lemon juice adds brightness and freshness to both sweet and savoury dishes, while lemon zest contributes fragrant oils that intensify aroma and flavour.@kimura2022acidity</w:t>
+        <w:t>Because of this intense acidity, lemons are rarely eaten on their own. Instead, they are widely used to enhance other foods and drinks. Lemon juice adds brightness and freshness to both sweet and savoury dishes, while lemon zest contributes fragrant oils that intensify aroma and flavour.[@kimura2022acidity]</w:t>
       </w:r>
     </w:p>
     <w:p>

</xml_diff>